<commit_message>
vault backup: 2026-08-26 09:20:12
</commit_message>
<xml_diff>
--- a/Kỹ thuật Phục hồi chức năng/01. Môn học Cơ sở (II.1)/MH09. Hóa sinh/Đề cương /4. Acid nucleic.docx
+++ b/Kỹ thuật Phục hồi chức năng/01. Môn học Cơ sở (II.1)/MH09. Hóa sinh/Đề cương /4. Acid nucleic.docx
@@ -10727,21 +10727,21 @@
       </w:pPr>
       <w:r>
         <w:rPr>
-          <w:highlight w:val="yellow"/>
+          <w:highlight w:val="none"/>
           <w:lang w:val="en-US"/>
         </w:rPr>
         <w:t xml:space="preserve">C.</w:t>
       </w:r>
       <w:r>
         <w:rPr>
-          <w:highlight w:val="yellow"/>
+          <w:highlight w:val="none"/>
           <w:lang w:val="en-US"/>
         </w:rPr>
         <w:t xml:space="preserve">Liên kết 2 chuỗ</w:t>
       </w:r>
       <w:r>
         <w:rPr>
-          <w:highlight w:val="yellow"/>
+          <w:highlight w:val="none"/>
           <w:lang w:val="en-US"/>
         </w:rPr>
         <w:t xml:space="preserve">i Nucleotid</w:t>
@@ -11842,7 +11842,7 @@
       </w:r>
       <w:r>
         <w:rPr>
-          <w:highlight w:val="yellow"/>
+          <w:highlight w:val="green"/>
           <w:lang w:val="en-US"/>
         </w:rPr>
         <w:t xml:space="preserve">D</w:t>
@@ -13614,7 +13614,7 @@
           <w:rFonts w:cs="Times New Roman"/>
           <w:b/>
           <w:szCs w:val="28"/>
-          <w:highlight w:val="green"/>
+          <w:highlight w:val="none"/>
           <w:lang w:val="en-US"/>
         </w:rPr>
         <w:t xml:space="preserve">Câu 59</w:t>
@@ -13624,7 +13624,7 @@
           <w:rFonts w:cs="Times New Roman"/>
           <w:b/>
           <w:szCs w:val="28"/>
-          <w:highlight w:val="green"/>
+          <w:highlight w:val="none"/>
           <w:lang w:val="en-US"/>
         </w:rPr>
         <w:t xml:space="preserve">:</w:t>

</xml_diff>